<commit_message>
punctuation version D working
</commit_message>
<xml_diff>
--- a/outputs/output-punctuation-d.docx
+++ b/outputs/output-punctuation-d.docx
@@ -25,6 +25,7 @@
       </w:r>
     </w:p>
     <w:p>
+      <w:proofErr w:type="gramStart"/>
       <w:r>
         <w:t/>
       </w:r>
@@ -34,9 +35,21 @@
         </w:rPr>
         <w:t/>
       </w:r>
+      <w:proofErr w:type="gramEnd"/>
+      <w:r>
+        <w:rPr>
+          <w:color w:val="E97132" w:themeColor="accent2"/>
+        </w:rPr>
+        <w:t/>
+      </w:r>
+      <w:proofErr w:type="gramStart"/>
       <w:r>
         <w:t xml:space="preserve">Alice</w:t>
       </w:r>
+      <w:proofErr w:type="gramEnd"/>
+      <w:r>
+        <w:t/>
+      </w:r>
       <w:r>
         <w:rPr>
           <w:color w:val="45B0E1" w:themeColor="accent1" w:themeTint="99"/>
@@ -44,7 +57,13 @@
         <w:t/>
       </w:r>
       <w:r>
-        <w:t xml:space="preserve"> is 22</w:t>
+        <w:t/>
+      </w:r>
+      <w:r>
+        <w:t xml:space="preserve"> is </w:t>
+      </w:r>
+      <w:r>
+        <w:t xml:space="preserve">22</w:t>
       </w:r>
       <w:r>
         <w:rPr>
@@ -53,37 +72,97 @@
         <w:t/>
       </w:r>
       <w:r>
-        <w:t xml:space="preserve"> years old</w:t>
-      </w:r>
-      <w:r>
-        <w:t xml:space="preserve"> , </w:t>
-      </w:r>
-      <w:r>
-        <w:rPr>
-          <w:color w:val="4EA72E" w:themeColor="accent6"/>
-        </w:rPr>
-        <w:t/>
-      </w:r>
-      <w:proofErr w:type="spellStart"/>
-      <w:r>
-        <w:rPr>
-          <w:color w:val="4EA72E" w:themeColor="accent6"/>
-        </w:rPr>
-        <w:t/>
-      </w:r>
-      <w:r>
-        <w:rPr>
-          <w:color w:val="4EA72E" w:themeColor="accent6"/>
-        </w:rPr>
-        <w:t/>
-      </w:r>
-      <w:proofErr w:type="spellEnd"/>
-      <w:r>
-        <w:rPr>
-          <w:color w:val="4EA72E" w:themeColor="accent6"/>
-        </w:rPr>
-        <w:t/>
-      </w:r>
+        <w:t/>
+      </w:r>
+      <w:r>
+        <w:t xml:space="preserve"> years </w:t>
+      </w:r>
+      <w:proofErr w:type="gramStart"/>
+      <w:r>
+        <w:t xml:space="preserve">old</w:t>
+      </w:r>
+      <w:r>
+        <w:t xml:space="preserve">; </w:t>
+      </w:r>
+      <w:proofErr w:type="gramEnd"/>
+      <w:r>
+        <w:t/>
+      </w:r>
+      <w:r>
+        <w:rPr>
+          <w:color w:val="4EA72E" w:themeColor="accent6"/>
+        </w:rPr>
+        <w:t/>
+      </w:r>
+      <w:proofErr w:type="gramStart"/>
+      <w:r>
+        <w:rPr>
+          <w:color w:val="4EA72E" w:themeColor="accent6"/>
+        </w:rPr>
+        <w:t/>
+      </w:r>
+      <w:r>
+        <w:rPr>
+          <w:color w:val="4EA72E" w:themeColor="accent6"/>
+        </w:rPr>
+        <w:t/>
+      </w:r>
+      <w:r>
+        <w:rPr>
+          <w:color w:val="4EA72E" w:themeColor="accent6"/>
+        </w:rPr>
+        <w:t/>
+      </w:r>
+      <w:r>
+        <w:rPr>
+          <w:color w:val="4EA72E" w:themeColor="accent6"/>
+        </w:rPr>
+        <w:t/>
+      </w:r>
+      <w:proofErr w:type="gramEnd"/>
+      <w:r>
+        <w:rPr>
+          <w:color w:val="4EA72E" w:themeColor="accent6"/>
+        </w:rPr>
+        <w:t/>
+      </w:r>
+      <w:r>
+        <w:rPr>
+          <w:color w:val="4EA72E" w:themeColor="accent6"/>
+        </w:rPr>
+        <w:t/>
+      </w:r>
+      <w:r>
+        <w:rPr>
+          <w:color w:val="4EA72E" w:themeColor="accent6"/>
+        </w:rPr>
+        <w:t/>
+      </w:r>
+      <w:r>
+        <w:rPr>
+          <w:color w:val="4EA72E" w:themeColor="accent6"/>
+        </w:rPr>
+        <w:t/>
+      </w:r>
+      <w:r>
+        <w:rPr>
+          <w:color w:val="4EA72E" w:themeColor="accent6"/>
+        </w:rPr>
+        <w:t/>
+      </w:r>
+      <w:r>
+        <w:rPr>
+          <w:color w:val="4EA72E" w:themeColor="accent6"/>
+        </w:rPr>
+        <w:t/>
+      </w:r>
+      <w:r>
+        <w:rPr>
+          <w:color w:val="4EA72E" w:themeColor="accent6"/>
+        </w:rPr>
+        <w:t/>
+      </w:r>
+      <w:proofErr w:type="gramStart"/>
       <w:r>
         <w:rPr>
           <w:color w:val="4EA72E" w:themeColor="accent6"/>
@@ -111,9 +190,21 @@
         </w:rPr>
         <w:t/>
       </w:r>
+      <w:proofErr w:type="gramEnd"/>
+      <w:r>
+        <w:rPr>
+          <w:color w:val="E97132" w:themeColor="accent2"/>
+        </w:rPr>
+        <w:t/>
+      </w:r>
+      <w:proofErr w:type="gramStart"/>
       <w:r>
         <w:t xml:space="preserve">Bob</w:t>
       </w:r>
+      <w:proofErr w:type="gramEnd"/>
+      <w:r>
+        <w:t/>
+      </w:r>
       <w:r>
         <w:rPr>
           <w:color w:val="45B0E1" w:themeColor="accent1" w:themeTint="99"/>
@@ -121,7 +212,13 @@
         <w:t/>
       </w:r>
       <w:r>
-        <w:t xml:space="preserve"> is 33</w:t>
+        <w:t/>
+      </w:r>
+      <w:r>
+        <w:t xml:space="preserve"> is </w:t>
+      </w:r>
+      <w:r>
+        <w:t xml:space="preserve">33</w:t>
       </w:r>
       <w:r>
         <w:rPr>
@@ -130,37 +227,97 @@
         <w:t/>
       </w:r>
       <w:r>
-        <w:t xml:space="preserve"> years old</w:t>
-      </w:r>
-      <w:r>
-        <w:t xml:space="preserve"> , </w:t>
-      </w:r>
-      <w:r>
-        <w:rPr>
-          <w:color w:val="4EA72E" w:themeColor="accent6"/>
-        </w:rPr>
-        <w:t/>
-      </w:r>
-      <w:proofErr w:type="spellStart"/>
-      <w:r>
-        <w:rPr>
-          <w:color w:val="4EA72E" w:themeColor="accent6"/>
-        </w:rPr>
-        <w:t/>
-      </w:r>
-      <w:r>
-        <w:rPr>
-          <w:color w:val="4EA72E" w:themeColor="accent6"/>
-        </w:rPr>
-        <w:t/>
-      </w:r>
-      <w:proofErr w:type="spellEnd"/>
-      <w:r>
-        <w:rPr>
-          <w:color w:val="4EA72E" w:themeColor="accent6"/>
-        </w:rPr>
-        <w:t/>
-      </w:r>
+        <w:t/>
+      </w:r>
+      <w:r>
+        <w:t xml:space="preserve"> years </w:t>
+      </w:r>
+      <w:proofErr w:type="gramStart"/>
+      <w:r>
+        <w:t xml:space="preserve">old</w:t>
+      </w:r>
+      <w:r>
+        <w:t xml:space="preserve">; </w:t>
+      </w:r>
+      <w:proofErr w:type="gramEnd"/>
+      <w:r>
+        <w:t/>
+      </w:r>
+      <w:r>
+        <w:rPr>
+          <w:color w:val="4EA72E" w:themeColor="accent6"/>
+        </w:rPr>
+        <w:t/>
+      </w:r>
+      <w:proofErr w:type="gramStart"/>
+      <w:r>
+        <w:rPr>
+          <w:color w:val="4EA72E" w:themeColor="accent6"/>
+        </w:rPr>
+        <w:t/>
+      </w:r>
+      <w:r>
+        <w:rPr>
+          <w:color w:val="4EA72E" w:themeColor="accent6"/>
+        </w:rPr>
+        <w:t/>
+      </w:r>
+      <w:r>
+        <w:rPr>
+          <w:color w:val="4EA72E" w:themeColor="accent6"/>
+        </w:rPr>
+        <w:t/>
+      </w:r>
+      <w:r>
+        <w:rPr>
+          <w:color w:val="4EA72E" w:themeColor="accent6"/>
+        </w:rPr>
+        <w:t/>
+      </w:r>
+      <w:proofErr w:type="gramEnd"/>
+      <w:r>
+        <w:rPr>
+          <w:color w:val="4EA72E" w:themeColor="accent6"/>
+        </w:rPr>
+        <w:t/>
+      </w:r>
+      <w:r>
+        <w:rPr>
+          <w:color w:val="4EA72E" w:themeColor="accent6"/>
+        </w:rPr>
+        <w:t/>
+      </w:r>
+      <w:r>
+        <w:rPr>
+          <w:color w:val="4EA72E" w:themeColor="accent6"/>
+        </w:rPr>
+        <w:t/>
+      </w:r>
+      <w:r>
+        <w:rPr>
+          <w:color w:val="4EA72E" w:themeColor="accent6"/>
+        </w:rPr>
+        <w:t/>
+      </w:r>
+      <w:r>
+        <w:rPr>
+          <w:color w:val="4EA72E" w:themeColor="accent6"/>
+        </w:rPr>
+        <w:t/>
+      </w:r>
+      <w:r>
+        <w:rPr>
+          <w:color w:val="4EA72E" w:themeColor="accent6"/>
+        </w:rPr>
+        <w:t/>
+      </w:r>
+      <w:r>
+        <w:rPr>
+          <w:color w:val="4EA72E" w:themeColor="accent6"/>
+        </w:rPr>
+        <w:t/>
+      </w:r>
+      <w:proofErr w:type="gramStart"/>
       <w:r>
         <w:rPr>
           <w:color w:val="4EA72E" w:themeColor="accent6"/>
@@ -188,9 +345,21 @@
         </w:rPr>
         <w:t/>
       </w:r>
+      <w:proofErr w:type="gramEnd"/>
+      <w:r>
+        <w:rPr>
+          <w:color w:val="E97132" w:themeColor="accent2"/>
+        </w:rPr>
+        <w:t/>
+      </w:r>
+      <w:proofErr w:type="gramStart"/>
       <w:r>
         <w:t xml:space="preserve">Charlie</w:t>
       </w:r>
+      <w:proofErr w:type="gramEnd"/>
+      <w:r>
+        <w:t/>
+      </w:r>
       <w:r>
         <w:rPr>
           <w:color w:val="45B0E1" w:themeColor="accent1" w:themeTint="99"/>
@@ -198,7 +367,13 @@
         <w:t/>
       </w:r>
       <w:r>
-        <w:t xml:space="preserve"> is 44</w:t>
+        <w:t/>
+      </w:r>
+      <w:r>
+        <w:t xml:space="preserve"> is </w:t>
+      </w:r>
+      <w:r>
+        <w:t xml:space="preserve">44</w:t>
       </w:r>
       <w:r>
         <w:rPr>
@@ -207,37 +382,97 @@
         <w:t/>
       </w:r>
       <w:r>
-        <w:t xml:space="preserve"> years old</w:t>
-      </w:r>
-      <w:r>
-        <w:t xml:space="preserve"> and </w:t>
-      </w:r>
-      <w:r>
-        <w:rPr>
-          <w:color w:val="4EA72E" w:themeColor="accent6"/>
-        </w:rPr>
-        <w:t/>
-      </w:r>
-      <w:proofErr w:type="spellStart"/>
-      <w:r>
-        <w:rPr>
-          <w:color w:val="4EA72E" w:themeColor="accent6"/>
-        </w:rPr>
-        <w:t/>
-      </w:r>
-      <w:r>
-        <w:rPr>
-          <w:color w:val="4EA72E" w:themeColor="accent6"/>
-        </w:rPr>
-        <w:t/>
-      </w:r>
-      <w:proofErr w:type="spellEnd"/>
-      <w:r>
-        <w:rPr>
-          <w:color w:val="4EA72E" w:themeColor="accent6"/>
-        </w:rPr>
-        <w:t/>
-      </w:r>
+        <w:t/>
+      </w:r>
+      <w:r>
+        <w:t xml:space="preserve"> years </w:t>
+      </w:r>
+      <w:proofErr w:type="gramStart"/>
+      <w:r>
+        <w:t xml:space="preserve">old</w:t>
+      </w:r>
+      <w:r>
+        <w:t xml:space="preserve">; and </w:t>
+      </w:r>
+      <w:proofErr w:type="gramEnd"/>
+      <w:r>
+        <w:t/>
+      </w:r>
+      <w:r>
+        <w:rPr>
+          <w:color w:val="4EA72E" w:themeColor="accent6"/>
+        </w:rPr>
+        <w:t/>
+      </w:r>
+      <w:proofErr w:type="gramStart"/>
+      <w:r>
+        <w:rPr>
+          <w:color w:val="4EA72E" w:themeColor="accent6"/>
+        </w:rPr>
+        <w:t/>
+      </w:r>
+      <w:r>
+        <w:rPr>
+          <w:color w:val="4EA72E" w:themeColor="accent6"/>
+        </w:rPr>
+        <w:t/>
+      </w:r>
+      <w:r>
+        <w:rPr>
+          <w:color w:val="4EA72E" w:themeColor="accent6"/>
+        </w:rPr>
+        <w:t/>
+      </w:r>
+      <w:r>
+        <w:rPr>
+          <w:color w:val="4EA72E" w:themeColor="accent6"/>
+        </w:rPr>
+        <w:t/>
+      </w:r>
+      <w:proofErr w:type="gramEnd"/>
+      <w:r>
+        <w:rPr>
+          <w:color w:val="4EA72E" w:themeColor="accent6"/>
+        </w:rPr>
+        <w:t/>
+      </w:r>
+      <w:r>
+        <w:rPr>
+          <w:color w:val="4EA72E" w:themeColor="accent6"/>
+        </w:rPr>
+        <w:t/>
+      </w:r>
+      <w:r>
+        <w:rPr>
+          <w:color w:val="4EA72E" w:themeColor="accent6"/>
+        </w:rPr>
+        <w:t/>
+      </w:r>
+      <w:r>
+        <w:rPr>
+          <w:color w:val="4EA72E" w:themeColor="accent6"/>
+        </w:rPr>
+        <w:t/>
+      </w:r>
+      <w:r>
+        <w:rPr>
+          <w:color w:val="4EA72E" w:themeColor="accent6"/>
+        </w:rPr>
+        <w:t/>
+      </w:r>
+      <w:r>
+        <w:rPr>
+          <w:color w:val="4EA72E" w:themeColor="accent6"/>
+        </w:rPr>
+        <w:t/>
+      </w:r>
+      <w:r>
+        <w:rPr>
+          <w:color w:val="4EA72E" w:themeColor="accent6"/>
+        </w:rPr>
+        <w:t/>
+      </w:r>
+      <w:proofErr w:type="gramStart"/>
       <w:r>
         <w:rPr>
           <w:color w:val="4EA72E" w:themeColor="accent6"/>
@@ -265,9 +500,21 @@
         </w:rPr>
         <w:t/>
       </w:r>
+      <w:proofErr w:type="gramEnd"/>
+      <w:r>
+        <w:rPr>
+          <w:color w:val="E97132" w:themeColor="accent2"/>
+        </w:rPr>
+        <w:t/>
+      </w:r>
+      <w:proofErr w:type="gramStart"/>
       <w:r>
         <w:t xml:space="preserve">Dylan</w:t>
       </w:r>
+      <w:proofErr w:type="gramEnd"/>
+      <w:r>
+        <w:t/>
+      </w:r>
       <w:r>
         <w:rPr>
           <w:color w:val="45B0E1" w:themeColor="accent1" w:themeTint="99"/>
@@ -275,7 +522,13 @@
         <w:t/>
       </w:r>
       <w:r>
-        <w:t xml:space="preserve"> is 55</w:t>
+        <w:t/>
+      </w:r>
+      <w:r>
+        <w:t xml:space="preserve"> is </w:t>
+      </w:r>
+      <w:r>
+        <w:t xml:space="preserve">55</w:t>
       </w:r>
       <w:r>
         <w:rPr>
@@ -284,55 +537,119 @@
         <w:t/>
       </w:r>
       <w:r>
-        <w:t xml:space="preserve"> years old</w:t>
-      </w:r>
-      <w:r>
-        <w:t/>
-      </w:r>
-      <w:r>
-        <w:rPr>
-          <w:color w:val="4EA72E" w:themeColor="accent6"/>
-        </w:rPr>
-        <w:t/>
-      </w:r>
-      <w:proofErr w:type="spellStart"/>
-      <w:r>
-        <w:rPr>
-          <w:color w:val="4EA72E" w:themeColor="accent6"/>
-        </w:rPr>
-        <w:t/>
-      </w:r>
-      <w:r>
-        <w:rPr>
-          <w:color w:val="4EA72E" w:themeColor="accent6"/>
-        </w:rPr>
-        <w:t/>
-      </w:r>
-      <w:proofErr w:type="spellEnd"/>
-      <w:r>
-        <w:rPr>
-          <w:color w:val="4EA72E" w:themeColor="accent6"/>
-        </w:rPr>
-        <w:t/>
-      </w:r>
-      <w:r>
-        <w:rPr>
-          <w:color w:val="4EA72E" w:themeColor="accent6"/>
-        </w:rPr>
-        <w:t/>
-      </w:r>
-      <w:r>
-        <w:rPr>
-          <w:color w:val="4EA72E" w:themeColor="accent6"/>
-        </w:rPr>
-        <w:t/>
-      </w:r>
-      <w:r>
-        <w:rPr>
-          <w:color w:val="4EA72E" w:themeColor="accent6"/>
-        </w:rPr>
-        <w:t/>
-      </w:r>
+        <w:t/>
+      </w:r>
+      <w:r>
+        <w:t xml:space="preserve"> years </w:t>
+      </w:r>
+      <w:proofErr w:type="gramStart"/>
+      <w:r>
+        <w:t xml:space="preserve">old</w:t>
+      </w:r>
+      <w:r>
+        <w:t/>
+      </w:r>
+      <w:proofErr w:type="gramEnd"/>
+      <w:r>
+        <w:t/>
+      </w:r>
+      <w:r>
+        <w:rPr>
+          <w:color w:val="4EA72E" w:themeColor="accent6"/>
+        </w:rPr>
+        <w:t/>
+      </w:r>
+      <w:proofErr w:type="gramStart"/>
+      <w:r>
+        <w:rPr>
+          <w:color w:val="4EA72E" w:themeColor="accent6"/>
+        </w:rPr>
+        <w:t/>
+      </w:r>
+      <w:r>
+        <w:rPr>
+          <w:color w:val="4EA72E" w:themeColor="accent6"/>
+        </w:rPr>
+        <w:t/>
+      </w:r>
+      <w:r>
+        <w:rPr>
+          <w:color w:val="4EA72E" w:themeColor="accent6"/>
+        </w:rPr>
+        <w:t/>
+      </w:r>
+      <w:r>
+        <w:rPr>
+          <w:color w:val="4EA72E" w:themeColor="accent6"/>
+        </w:rPr>
+        <w:t/>
+      </w:r>
+      <w:proofErr w:type="gramEnd"/>
+      <w:r>
+        <w:rPr>
+          <w:color w:val="4EA72E" w:themeColor="accent6"/>
+        </w:rPr>
+        <w:t/>
+      </w:r>
+      <w:r>
+        <w:rPr>
+          <w:color w:val="4EA72E" w:themeColor="accent6"/>
+        </w:rPr>
+        <w:t/>
+      </w:r>
+      <w:r>
+        <w:rPr>
+          <w:color w:val="4EA72E" w:themeColor="accent6"/>
+        </w:rPr>
+        <w:t/>
+      </w:r>
+      <w:r>
+        <w:rPr>
+          <w:color w:val="4EA72E" w:themeColor="accent6"/>
+        </w:rPr>
+        <w:t/>
+      </w:r>
+      <w:r>
+        <w:rPr>
+          <w:color w:val="4EA72E" w:themeColor="accent6"/>
+        </w:rPr>
+        <w:t/>
+      </w:r>
+      <w:r>
+        <w:rPr>
+          <w:color w:val="4EA72E" w:themeColor="accent6"/>
+        </w:rPr>
+        <w:t/>
+      </w:r>
+      <w:r>
+        <w:rPr>
+          <w:color w:val="4EA72E" w:themeColor="accent6"/>
+        </w:rPr>
+        <w:t/>
+      </w:r>
+      <w:proofErr w:type="gramStart"/>
+      <w:r>
+        <w:rPr>
+          <w:color w:val="4EA72E" w:themeColor="accent6"/>
+        </w:rPr>
+        <w:t/>
+      </w:r>
+      <w:r>
+        <w:rPr>
+          <w:color w:val="4EA72E" w:themeColor="accent6"/>
+        </w:rPr>
+        <w:t/>
+      </w:r>
+      <w:r>
+        <w:rPr>
+          <w:color w:val="4EA72E" w:themeColor="accent6"/>
+        </w:rPr>
+        <w:t/>
+      </w:r>
+      <w:r>
+        <w:t/>
+      </w:r>
+      <w:proofErr w:type="gramEnd"/>
       <w:r>
         <w:t/>
       </w:r>

</xml_diff>